<commit_message>
fix err downloads && add ru ver
</commit_message>
<xml_diff>
--- a/2026/03/docx/ru/CV_Ponomarov_Serhii_26_03_CNC.docx
+++ b/2026/03/docx/ru/CV_Ponomarov_Serhii_26_03_CNC.docx
@@ -99,12 +99,12 @@
                   <wp:extent cx="1576768" cy="1576768"/>
                   <wp:effectExtent b="0" l="0" r="0" t="0"/>
                   <wp:wrapTopAndBottom distB="114300" distT="114300"/>
-                  <wp:docPr id="2" name="image1.png"/>
+                  <wp:docPr id="2" name="image2.png"/>
                   <a:graphic>
                     <a:graphicData uri="http://schemas.openxmlformats.org/drawingml/2006/picture">
                       <pic:pic>
                         <pic:nvPicPr>
-                          <pic:cNvPr id="0" name="image1.png"/>
+                          <pic:cNvPr id="0" name="image2.png"/>
                           <pic:cNvPicPr preferRelativeResize="0"/>
                         </pic:nvPicPr>
                         <pic:blipFill>
@@ -726,12 +726,12 @@
                 <wp:inline distB="114300" distT="114300" distL="114300" distR="114300">
                   <wp:extent cx="3981450" cy="25400"/>
                   <wp:effectExtent b="0" l="0" r="0" t="0"/>
-                  <wp:docPr descr="horizontal line" id="1" name="image2.png"/>
+                  <wp:docPr descr="horizontal line" id="1" name="image1.png"/>
                   <a:graphic>
                     <a:graphicData uri="http://schemas.openxmlformats.org/drawingml/2006/picture">
                       <pic:pic>
                         <pic:nvPicPr>
-                          <pic:cNvPr descr="horizontal line" id="0" name="image2.png"/>
+                          <pic:cNvPr descr="horizontal line" id="0" name="image1.png"/>
                           <pic:cNvPicPr preferRelativeResize="0"/>
                         </pic:nvPicPr>
                         <pic:blipFill>

</xml_diff>